<commit_message>
added links to prod and dev
</commit_message>
<xml_diff>
--- a/projectDocumentary/ChNU Jobs.docx
+++ b/projectDocumentary/ChNU Jobs.docx
@@ -26,6 +26,39 @@
         <w:t> веб-сайт для працевлаштування студентів</w:t>
       </w:r>
     </w:p>
+    <w:p>
+      <w:pPr>
+        <w:rPr>
+          <w:sz w:val="28"/>
+          <w:szCs w:val="28"/>
+        </w:rPr>
+      </w:pPr>
+    </w:p>
+    <w:p>
+      <w:r>
+        <w:t xml:space="preserve">Production: </w:t>
+      </w:r>
+      <w:hyperlink r:id="rId5" w:history="1">
+        <w:r>
+          <w:rPr>
+            <w:rStyle w:val="Hyperlink"/>
+          </w:rPr>
+          <w:t>https://python-web-petryk-main.onrender.com</w:t>
+        </w:r>
+      </w:hyperlink>
+      <w:r>
+        <w:br/>
+        <w:t xml:space="preserve">Dev: </w:t>
+      </w:r>
+      <w:hyperlink r:id="rId6" w:history="1">
+        <w:r>
+          <w:rPr>
+            <w:rStyle w:val="Hyperlink"/>
+          </w:rPr>
+          <w:t>https://python-web-petryk-dev.onrender.com</w:t>
+        </w:r>
+      </w:hyperlink>
+    </w:p>
     <w:p/>
     <w:p>
       <w:r>
@@ -423,7 +456,6 @@
           <w:sz w:val="28"/>
           <w:szCs w:val="28"/>
         </w:rPr>
-        <w:lastRenderedPageBreak/>
         <w:t>Основні сутності</w:t>
       </w:r>
     </w:p>
@@ -904,7 +936,6 @@
           <w:sz w:val="28"/>
           <w:szCs w:val="28"/>
         </w:rPr>
-        <w:lastRenderedPageBreak/>
         <w:t>Основні сценарії використання</w:t>
       </w:r>
     </w:p>
@@ -1319,6 +1350,8 @@
         <w:t>Компанія обирає заявку і змінює її статус (New → InReview → Interview / Rejected / Offer)</w:t>
       </w:r>
     </w:p>
+    <w:p/>
+    <w:p/>
     <w:p/>
     <w:sectPr>
       <w:pgSz w:w="11906" w:h="16838"/>
@@ -5112,6 +5145,7 @@
   <w:style w:type="character" w:default="1" w:styleId="DefaultParagraphFont">
     <w:name w:val="Default Paragraph Font"/>
     <w:uiPriority w:val="1"/>
+    <w:semiHidden/>
     <w:unhideWhenUsed/>
   </w:style>
   <w:style w:type="table" w:default="1" w:styleId="TableNormal">

</xml_diff>